<commit_message>
Added 2 tests, and edit report
</commit_message>
<xml_diff>
--- a/Отчет_ЛР2_Коновальчук.docx
+++ b/Отчет_ЛР2_Коновальчук.docx
@@ -4057,6 +4057,422 @@
           </w:p>
         </w:tc>
       </w:tr>
+      <w:tr>
+        <w:tc>
+          <w:tcPr>
+            <w:tcW w:w="432" w:type="dxa"/>
+            <w:tcMar>
+              <w:top w:w="150" w:type="dxa"/>
+              <w:left w:w="0" w:type="dxa"/>
+              <w:bottom w:w="150" w:type="dxa"/>
+              <w:right w:w="240" w:type="dxa"/>
+            </w:tcMar>
+            <w:vAlign w:val="center"/>
+            <w:hideMark/>
+          </w:tcPr>
+          <w:p>
+            <w:pPr>
+              <w:spacing w:after="0" w:line="375" w:lineRule="atLeast"/>
+              <w:jc w:val="left"/>
+              <w:rPr>
+                <w:rFonts w:ascii="Segoe UI" w:eastAsia="Times New Roman" w:hAnsi="Segoe UI" w:cs="Segoe UI"/>
+                <w:sz w:val="20"/>
+                <w:szCs w:val="23"/>
+                <w:lang w:val="en-US" w:eastAsia="ru-RU"/>
+              </w:rPr>
+            </w:pPr>
+            <w:r>
+              <w:rPr>
+                <w:rFonts w:ascii="Segoe UI" w:eastAsia="Times New Roman" w:hAnsi="Segoe UI" w:cs="Segoe UI"/>
+                <w:sz w:val="20"/>
+                <w:szCs w:val="23"/>
+                <w:lang w:val="en-US" w:eastAsia="ru-RU"/>
+              </w:rPr>
+              <w:t>4</w:t>
+            </w:r>
+          </w:p>
+        </w:tc>
+        <w:tc>
+          <w:tcPr>
+            <w:tcW w:w="2404" w:type="dxa"/>
+            <w:tcMar>
+              <w:top w:w="150" w:type="dxa"/>
+              <w:left w:w="240" w:type="dxa"/>
+              <w:bottom w:w="150" w:type="dxa"/>
+              <w:right w:w="240" w:type="dxa"/>
+            </w:tcMar>
+            <w:vAlign w:val="center"/>
+            <w:hideMark/>
+          </w:tcPr>
+          <w:p>
+            <w:pPr>
+              <w:spacing w:after="0" w:line="375" w:lineRule="atLeast"/>
+              <w:jc w:val="left"/>
+              <w:rPr>
+                <w:rFonts w:ascii="Consolas" w:eastAsia="Times New Roman" w:hAnsi="Consolas" w:cs="Courier New"/>
+                <w:sz w:val="20"/>
+                <w:lang w:val="en-US" w:eastAsia="ru-RU"/>
+              </w:rPr>
+            </w:pPr>
+            <w:r>
+              <w:rPr>
+                <w:rFonts w:ascii="Consolas" w:eastAsia="Times New Roman" w:hAnsi="Consolas" w:cs="Courier New"/>
+                <w:sz w:val="20"/>
+                <w:lang w:val="en-US" w:eastAsia="ru-RU"/>
+              </w:rPr>
+              <w:t>Test_cose_rounded_not_truncated</w:t>
+            </w:r>
+          </w:p>
+        </w:tc>
+        <w:tc>
+          <w:tcPr>
+            <w:tcW w:w="1417" w:type="dxa"/>
+            <w:tcMar>
+              <w:top w:w="150" w:type="dxa"/>
+              <w:left w:w="240" w:type="dxa"/>
+              <w:bottom w:w="150" w:type="dxa"/>
+              <w:right w:w="240" w:type="dxa"/>
+            </w:tcMar>
+            <w:vAlign w:val="center"/>
+            <w:hideMark/>
+          </w:tcPr>
+          <w:p>
+            <w:pPr>
+              <w:spacing w:after="0" w:line="375" w:lineRule="atLeast"/>
+              <w:jc w:val="left"/>
+              <w:rPr>
+                <w:rFonts w:ascii="Segoe UI" w:eastAsia="Times New Roman" w:hAnsi="Segoe UI" w:cs="Segoe UI"/>
+                <w:b/>
+                <w:bCs/>
+                <w:sz w:val="20"/>
+                <w:lang w:eastAsia="ru-RU"/>
+              </w:rPr>
+            </w:pPr>
+            <w:r>
+              <w:rPr>
+                <w:rFonts w:ascii="Segoe UI" w:eastAsia="Times New Roman" w:hAnsi="Segoe UI" w:cs="Segoe UI"/>
+                <w:b/>
+                <w:bCs/>
+                <w:sz w:val="20"/>
+                <w:lang w:eastAsia="ru-RU"/>
+              </w:rPr>
+              <w:t>48</w:t>
+            </w:r>
+          </w:p>
+        </w:tc>
+        <w:tc>
+          <w:tcPr>
+            <w:tcW w:w="4718" w:type="dxa"/>
+            <w:tcMar>
+              <w:top w:w="150" w:type="dxa"/>
+              <w:left w:w="240" w:type="dxa"/>
+              <w:bottom w:w="150" w:type="dxa"/>
+              <w:right w:w="240" w:type="dxa"/>
+            </w:tcMar>
+            <w:vAlign w:val="center"/>
+            <w:hideMark/>
+          </w:tcPr>
+          <w:p>
+            <w:pPr>
+              <w:spacing w:after="0" w:line="375" w:lineRule="atLeast"/>
+              <w:jc w:val="left"/>
+              <w:rPr>
+                <w:rFonts w:ascii="Segoe UI" w:eastAsia="Times New Roman" w:hAnsi="Segoe UI" w:cs="Segoe UI"/>
+                <w:sz w:val="20"/>
+                <w:szCs w:val="23"/>
+                <w:lang w:eastAsia="ru-RU"/>
+              </w:rPr>
+            </w:pPr>
+            <w:r>
+              <w:rPr>
+                <w:rFonts w:ascii="Segoe UI" w:eastAsia="Times New Roman" w:hAnsi="Segoe UI" w:cs="Segoe UI"/>
+                <w:sz w:val="20"/>
+                <w:szCs w:val="23"/>
+                <w:lang w:eastAsia="ru-RU"/>
+              </w:rPr>
+              <w:t xml:space="preserve">Функция возращает </w:t>
+            </w:r>
+            <w:r>
+              <w:rPr>
+                <w:rFonts w:ascii="Segoe UI" w:eastAsia="Times New Roman" w:hAnsi="Segoe UI" w:cs="Segoe UI"/>
+                <w:sz w:val="20"/>
+                <w:szCs w:val="23"/>
+                <w:lang w:val="en-US" w:eastAsia="ru-RU"/>
+              </w:rPr>
+              <w:t xml:space="preserve">int </w:t>
+            </w:r>
+            <w:r>
+              <w:rPr>
+                <w:rFonts w:ascii="Segoe UI" w:eastAsia="Times New Roman" w:hAnsi="Segoe UI" w:cs="Segoe UI"/>
+                <w:sz w:val="20"/>
+                <w:szCs w:val="23"/>
+                <w:lang w:eastAsia="ru-RU"/>
+              </w:rPr>
+              <w:t>значение, из-за этого оно не округляется, а отбрасывет дробную часть.</w:t>
+            </w:r>
+          </w:p>
+        </w:tc>
+        <w:tc>
+          <w:tcPr>
+            <w:tcW w:w="2370" w:type="dxa"/>
+            <w:tcMar>
+              <w:top w:w="150" w:type="dxa"/>
+              <w:left w:w="240" w:type="dxa"/>
+              <w:bottom w:w="150" w:type="dxa"/>
+              <w:right w:w="0" w:type="dxa"/>
+            </w:tcMar>
+            <w:vAlign w:val="center"/>
+            <w:hideMark/>
+          </w:tcPr>
+          <w:p>
+            <w:pPr>
+              <w:spacing w:after="0" w:line="375" w:lineRule="atLeast"/>
+              <w:jc w:val="left"/>
+              <w:rPr>
+                <w:rFonts w:ascii="Segoe UI" w:eastAsia="Times New Roman" w:hAnsi="Segoe UI" w:cs="Segoe UI"/>
+                <w:sz w:val="20"/>
+                <w:szCs w:val="23"/>
+                <w:lang w:val="en-US" w:eastAsia="ru-RU"/>
+              </w:rPr>
+            </w:pPr>
+            <w:r>
+              <w:rPr>
+                <w:rFonts w:ascii="Segoe UI" w:eastAsia="Times New Roman" w:hAnsi="Segoe UI" w:cs="Segoe UI"/>
+                <w:sz w:val="20"/>
+                <w:szCs w:val="23"/>
+                <w:lang w:eastAsia="ru-RU"/>
+              </w:rPr>
+              <w:t xml:space="preserve">Заменить </w:t>
+            </w:r>
+            <w:r>
+              <w:rPr>
+                <w:rFonts w:ascii="Segoe UI" w:eastAsia="Times New Roman" w:hAnsi="Segoe UI" w:cs="Segoe UI"/>
+                <w:sz w:val="20"/>
+                <w:szCs w:val="23"/>
+                <w:lang w:val="en-US" w:eastAsia="ru-RU"/>
+              </w:rPr>
+              <w:t xml:space="preserve">return int(total_cost), </w:t>
+            </w:r>
+            <w:r>
+              <w:rPr>
+                <w:rFonts w:ascii="Segoe UI" w:eastAsia="Times New Roman" w:hAnsi="Segoe UI" w:cs="Segoe UI"/>
+                <w:sz w:val="20"/>
+                <w:szCs w:val="23"/>
+                <w:lang w:eastAsia="ru-RU"/>
+              </w:rPr>
+              <w:t xml:space="preserve">на </w:t>
+            </w:r>
+            <w:r>
+              <w:rPr>
+                <w:rFonts w:ascii="Segoe UI" w:eastAsia="Times New Roman" w:hAnsi="Segoe UI" w:cs="Segoe UI"/>
+                <w:sz w:val="20"/>
+                <w:szCs w:val="23"/>
+                <w:lang w:val="en-US" w:eastAsia="ru-RU"/>
+              </w:rPr>
+              <w:t>return round(total_cost)</w:t>
+            </w:r>
+          </w:p>
+        </w:tc>
+      </w:tr>
+      <w:tr>
+        <w:tc>
+          <w:tcPr>
+            <w:tcW w:w="432" w:type="dxa"/>
+            <w:tcMar>
+              <w:top w:w="150" w:type="dxa"/>
+              <w:left w:w="0" w:type="dxa"/>
+              <w:bottom w:w="150" w:type="dxa"/>
+              <w:right w:w="240" w:type="dxa"/>
+            </w:tcMar>
+            <w:vAlign w:val="center"/>
+            <w:hideMark/>
+          </w:tcPr>
+          <w:p>
+            <w:pPr>
+              <w:spacing w:after="0" w:line="375" w:lineRule="atLeast"/>
+              <w:jc w:val="left"/>
+              <w:rPr>
+                <w:rFonts w:ascii="Segoe UI" w:eastAsia="Times New Roman" w:hAnsi="Segoe UI" w:cs="Segoe UI"/>
+                <w:sz w:val="20"/>
+                <w:szCs w:val="23"/>
+                <w:lang w:val="en-US" w:eastAsia="ru-RU"/>
+              </w:rPr>
+            </w:pPr>
+            <w:r>
+              <w:rPr>
+                <w:rFonts w:ascii="Segoe UI" w:eastAsia="Times New Roman" w:hAnsi="Segoe UI" w:cs="Segoe UI"/>
+                <w:sz w:val="20"/>
+                <w:szCs w:val="23"/>
+                <w:lang w:val="en-US" w:eastAsia="ru-RU"/>
+              </w:rPr>
+              <w:t>5</w:t>
+            </w:r>
+          </w:p>
+        </w:tc>
+        <w:tc>
+          <w:tcPr>
+            <w:tcW w:w="2404" w:type="dxa"/>
+            <w:tcMar>
+              <w:top w:w="150" w:type="dxa"/>
+              <w:left w:w="240" w:type="dxa"/>
+              <w:bottom w:w="150" w:type="dxa"/>
+              <w:right w:w="240" w:type="dxa"/>
+            </w:tcMar>
+            <w:vAlign w:val="center"/>
+            <w:hideMark/>
+          </w:tcPr>
+          <w:p>
+            <w:pPr>
+              <w:spacing w:after="0" w:line="375" w:lineRule="atLeast"/>
+              <w:jc w:val="left"/>
+              <w:rPr>
+                <w:rFonts w:ascii="Consolas" w:eastAsia="Times New Roman" w:hAnsi="Consolas" w:cs="Courier New"/>
+                <w:sz w:val="20"/>
+                <w:lang w:val="en-US" w:eastAsia="ru-RU"/>
+              </w:rPr>
+            </w:pPr>
+            <w:r>
+              <w:rPr>
+                <w:rFonts w:ascii="Consolas" w:eastAsia="Times New Roman" w:hAnsi="Consolas" w:cs="Courier New"/>
+                <w:sz w:val="20"/>
+                <w:lang w:val="en-US" w:eastAsia="ru-RU"/>
+              </w:rPr>
+              <w:t>Test_delivery_date_with_express</w:t>
+            </w:r>
+          </w:p>
+        </w:tc>
+        <w:tc>
+          <w:tcPr>
+            <w:tcW w:w="1417" w:type="dxa"/>
+            <w:tcMar>
+              <w:top w:w="150" w:type="dxa"/>
+              <w:left w:w="240" w:type="dxa"/>
+              <w:bottom w:w="150" w:type="dxa"/>
+              <w:right w:w="240" w:type="dxa"/>
+            </w:tcMar>
+            <w:vAlign w:val="center"/>
+            <w:hideMark/>
+          </w:tcPr>
+          <w:p>
+            <w:pPr>
+              <w:spacing w:after="0" w:line="375" w:lineRule="atLeast"/>
+              <w:jc w:val="left"/>
+              <w:rPr>
+                <w:rFonts w:ascii="Segoe UI" w:eastAsia="Times New Roman" w:hAnsi="Segoe UI" w:cs="Segoe UI"/>
+                <w:b/>
+                <w:bCs/>
+                <w:sz w:val="20"/>
+                <w:lang w:val="en-US" w:eastAsia="ru-RU"/>
+              </w:rPr>
+            </w:pPr>
+            <w:r>
+              <w:rPr>
+                <w:rFonts w:ascii="Segoe UI" w:eastAsia="Times New Roman" w:hAnsi="Segoe UI" w:cs="Segoe UI"/>
+                <w:b/>
+                <w:bCs/>
+                <w:sz w:val="20"/>
+                <w:lang w:val="en-US" w:eastAsia="ru-RU"/>
+              </w:rPr>
+              <w:t>44</w:t>
+            </w:r>
+          </w:p>
+        </w:tc>
+        <w:tc>
+          <w:tcPr>
+            <w:tcW w:w="4718" w:type="dxa"/>
+            <w:tcMar>
+              <w:top w:w="150" w:type="dxa"/>
+              <w:left w:w="240" w:type="dxa"/>
+              <w:bottom w:w="150" w:type="dxa"/>
+              <w:right w:w="240" w:type="dxa"/>
+            </w:tcMar>
+            <w:vAlign w:val="center"/>
+            <w:hideMark/>
+          </w:tcPr>
+          <w:p>
+            <w:pPr>
+              <w:spacing w:after="0" w:line="375" w:lineRule="atLeast"/>
+              <w:jc w:val="left"/>
+              <w:rPr>
+                <w:rFonts w:ascii="Segoe UI" w:eastAsia="Times New Roman" w:hAnsi="Segoe UI" w:cs="Segoe UI"/>
+                <w:sz w:val="20"/>
+                <w:szCs w:val="23"/>
+                <w:lang w:eastAsia="ru-RU"/>
+              </w:rPr>
+            </w:pPr>
+            <w:r>
+              <w:rPr>
+                <w:rFonts w:ascii="Segoe UI" w:eastAsia="Times New Roman" w:hAnsi="Segoe UI" w:cs="Segoe UI"/>
+                <w:sz w:val="20"/>
+                <w:szCs w:val="23"/>
+                <w:lang w:eastAsia="ru-RU"/>
+              </w:rPr>
+              <w:t xml:space="preserve">В ТЗ есть усливие, что минилаьный срок доставки равен 1 дню, а при экспресс доставке у нас получается 0 дней на доставку. </w:t>
+            </w:r>
+          </w:p>
+        </w:tc>
+        <w:tc>
+          <w:tcPr>
+            <w:tcW w:w="2370" w:type="dxa"/>
+            <w:tcMar>
+              <w:top w:w="150" w:type="dxa"/>
+              <w:left w:w="240" w:type="dxa"/>
+              <w:bottom w:w="150" w:type="dxa"/>
+              <w:right w:w="0" w:type="dxa"/>
+            </w:tcMar>
+            <w:vAlign w:val="center"/>
+            <w:hideMark/>
+          </w:tcPr>
+          <w:p>
+            <w:pPr>
+              <w:spacing w:after="0" w:line="375" w:lineRule="atLeast"/>
+              <w:jc w:val="left"/>
+              <w:rPr>
+                <w:rFonts w:ascii="Segoe UI" w:eastAsia="Times New Roman" w:hAnsi="Segoe UI" w:cs="Segoe UI"/>
+                <w:sz w:val="20"/>
+                <w:szCs w:val="23"/>
+                <w:lang w:val="en-US" w:eastAsia="ru-RU"/>
+              </w:rPr>
+            </w:pPr>
+            <w:r>
+              <w:rPr>
+                <w:rFonts w:ascii="Segoe UI" w:eastAsia="Times New Roman" w:hAnsi="Segoe UI" w:cs="Segoe UI"/>
+                <w:sz w:val="20"/>
+                <w:szCs w:val="23"/>
+                <w:lang w:eastAsia="ru-RU"/>
+              </w:rPr>
+              <w:t xml:space="preserve">Заменить </w:t>
+            </w:r>
+            <w:r>
+              <w:rPr>
+                <w:rFonts w:ascii="Segoe UI" w:eastAsia="Times New Roman" w:hAnsi="Segoe UI" w:cs="Segoe UI"/>
+                <w:sz w:val="20"/>
+                <w:szCs w:val="23"/>
+                <w:lang w:val="en-US" w:eastAsia="ru-RU"/>
+              </w:rPr>
+              <w:t xml:space="preserve">days_needed = days_needed // 2, </w:t>
+            </w:r>
+            <w:r>
+              <w:rPr>
+                <w:rFonts w:ascii="Segoe UI" w:eastAsia="Times New Roman" w:hAnsi="Segoe UI" w:cs="Segoe UI"/>
+                <w:sz w:val="20"/>
+                <w:szCs w:val="23"/>
+                <w:lang w:eastAsia="ru-RU"/>
+              </w:rPr>
+              <w:t xml:space="preserve">на </w:t>
+            </w:r>
+            <w:r>
+              <w:rPr>
+                <w:rFonts w:ascii="Segoe UI" w:eastAsia="Times New Roman" w:hAnsi="Segoe UI" w:cs="Segoe UI"/>
+                <w:sz w:val="20"/>
+                <w:szCs w:val="23"/>
+                <w:lang w:val="en-US" w:eastAsia="ru-RU"/>
+              </w:rPr>
+              <w:t>days_needed = max(1 ,days_needed // 2)</w:t>
+            </w:r>
+          </w:p>
+        </w:tc>
+      </w:tr>
     </w:tbl>
     <w:p>
       <w:pPr>
@@ -4071,38 +4487,6 @@
           <w:lang w:eastAsia="ru-RU"/>
         </w:rPr>
       </w:pPr>
-      <w:r>
-        <w:rPr>
-          <w:rFonts w:ascii="Segoe UI" w:eastAsia="Times New Roman" w:hAnsi="Segoe UI" w:cs="Segoe UI"/>
-          <w:color w:val="0F1115"/>
-          <w:sz w:val="24"/>
-          <w:szCs w:val="24"/>
-          <w:lang w:eastAsia="ru-RU"/>
-        </w:rPr>
-        <w:t xml:space="preserve">Все три упавших теста указывают на </w:t>
-      </w:r>
-      <w:r>
-        <w:rPr>
-          <w:rFonts w:ascii="Segoe UI" w:eastAsia="Times New Roman" w:hAnsi="Segoe UI" w:cs="Segoe UI"/>
-          <w:b/>
-          <w:bCs/>
-          <w:color w:val="0F1115"/>
-          <w:sz w:val="24"/>
-          <w:szCs w:val="24"/>
-          <w:lang w:eastAsia="ru-RU"/>
-        </w:rPr>
-        <w:t>одну строку</w:t>
-      </w:r>
-      <w:r>
-        <w:rPr>
-          <w:rFonts w:ascii="Segoe UI" w:eastAsia="Times New Roman" w:hAnsi="Segoe UI" w:cs="Segoe UI"/>
-          <w:color w:val="0F1115"/>
-          <w:sz w:val="24"/>
-          <w:szCs w:val="24"/>
-          <w:lang w:eastAsia="ru-RU"/>
-        </w:rPr>
-        <w:t xml:space="preserve"> — № 34. Это классический случай, когда один дефект ломает сразу несколько аспектов поведения функции.</w:t>
-      </w:r>
     </w:p>
     <w:sectPr>
       <w:pgSz w:w="11906" w:h="16838"/>
@@ -4827,7 +5211,7 @@
 </file>
 
 <file path=customXml/itemProps1.xml><?xml version="1.0" encoding="utf-8"?>
-<ds:datastoreItem xmlns:ds="http://schemas.openxmlformats.org/officeDocument/2006/customXml" ds:itemID="{E17BB219-3824-4DF4-8FFB-976A4BD9BF2E}">
+<ds:datastoreItem xmlns:ds="http://schemas.openxmlformats.org/officeDocument/2006/customXml" ds:itemID="{88849827-39EF-46CC-BDEB-8A3AA8C36484}">
   <ds:schemaRefs>
     <ds:schemaRef ds:uri="http://schemas.openxmlformats.org/officeDocument/2006/bibliography"/>
   </ds:schemaRefs>

</xml_diff>